<commit_message>
Expand midterm speaker notes to 10 minutes
Co-Authored-By: Claude Opus 5.5 <noreply@anthropic.com>
Claude-Session: https://claude.ai/code/session_01Bwh39UnA2AtEyvQMyknFM2
</commit_message>
<xml_diff>
--- a/outputs/Speaker_Notes_Midterm.docx
+++ b/outputs/Speaker_Notes_Midterm.docx
@@ -2,72 +2,13 @@
 <file path=word/document.xml><?xml version="1.0" encoding="utf-8"?>
 <w:document xmlns:w="http://schemas.openxmlformats.org/wordprocessingml/2006/main" xmlns:m="http://schemas.openxmlformats.org/officeDocument/2006/math" xmlns:r="http://schemas.openxmlformats.org/officeDocument/2006/relationships" xmlns:o="urn:schemas-microsoft-com:office:office" xmlns:v="urn:schemas-microsoft-com:vml" xmlns:w10="urn:schemas-microsoft-com:office:word" xmlns:a="http://schemas.openxmlformats.org/drawingml/2006/main" xmlns:pic="http://schemas.openxmlformats.org/drawingml/2006/picture" xmlns:wp="http://schemas.openxmlformats.org/drawingml/2006/wordprocessingDrawing">
   <w:body>
-    <w:p>
-      <w:pPr>
-        <w:pStyle w:val="Title"/>
-      </w:pPr>
-      <w:r>
-        <w:t xml:space="preserve">Speaker</w:t>
-      </w:r>
-      <w:r>
-        <w:t xml:space="preserve"> </w:t>
-      </w:r>
-      <w:r>
-        <w:t xml:space="preserve">notes</w:t>
-      </w:r>
-      <w:r>
-        <w:t xml:space="preserve"> </w:t>
-      </w:r>
-      <w:r>
-        <w:t xml:space="preserve">—</w:t>
-      </w:r>
-      <w:r>
-        <w:t xml:space="preserve"> </w:t>
-      </w:r>
-      <w:r>
-        <w:t xml:space="preserve">Smart</w:t>
-      </w:r>
-      <w:r>
-        <w:t xml:space="preserve"> </w:t>
-      </w:r>
-      <w:r>
-        <w:t xml:space="preserve">Traffic</w:t>
-      </w:r>
-      <w:r>
-        <w:t xml:space="preserve"> </w:t>
-      </w:r>
-      <w:r>
-        <w:t xml:space="preserve">Lights</w:t>
-      </w:r>
-      <w:r>
-        <w:t xml:space="preserve"> </w:t>
-      </w:r>
-      <w:r>
-        <w:t xml:space="preserve">That</w:t>
-      </w:r>
-      <w:r>
-        <w:t xml:space="preserve"> </w:t>
-      </w:r>
-      <w:r>
-        <w:t xml:space="preserve">Learn</w:t>
-      </w:r>
-      <w:r>
-        <w:t xml:space="preserve"> </w:t>
-      </w:r>
-      <w:r>
-        <w:t xml:space="preserve">(midterm,</w:t>
-      </w:r>
-      <w:r>
-        <w:t xml:space="preserve"> </w:t>
-      </w:r>
-      <w:r>
-        <w:t xml:space="preserve">5</w:t>
-      </w:r>
-      <w:r>
-        <w:t xml:space="preserve"> </w:t>
-      </w:r>
-      <w:r>
-        <w:t xml:space="preserve">minutes)</w:t>
+    <w:bookmarkStart w:id="30" w:name="X356062213ae04e9af47220a64bfdcc284a4a191"/>
+    <w:p>
+      <w:pPr>
+        <w:pStyle w:val="Heading1"/>
+      </w:pPr>
+      <w:r>
+        <w:t xml:space="preserve">Speaker notes — Smart Traffic Lights That Learn (midterm, 10 minutes)</w:t>
       </w:r>
     </w:p>
     <w:p>
@@ -75,7 +16,7 @@
         <w:pStyle w:val="FirstParagraph"/>
       </w:pPr>
       <w:r>
-        <w:t xml:space="preserve">Total: 731 words ≈ 4.9 minutes at 150 words per minute.</w:t>
+        <w:t xml:space="preserve">Total: 1488 words ≈ 9.9 minutes at 150 words per minute (about one minute per slide).</w:t>
       </w:r>
     </w:p>
     <w:bookmarkStart w:id="20" w:name="slide-1-smart-traffic-lights-that-learn"/>
@@ -96,7 +37,7 @@
           <w:iCs/>
           <w:i/>
         </w:rPr>
-        <w:t xml:space="preserve">≈ 23 seconds (57 words)</w:t>
+        <w:t xml:space="preserve">≈ 0:46 min (116 words)</w:t>
       </w:r>
     </w:p>
     <w:p>
@@ -104,7 +45,7 @@
         <w:pStyle w:val="BodyText"/>
       </w:pPr>
       <w:r>
-        <w:t xml:space="preserve">Hello, we are Amangeldy and Aidar. Our project is a systematic literature review on traffic lights that learn by themselves using reinforcement learning. In the next five minutes we will show the problem, our research questions, how we run the review, what we have already built, and why we say the project is about fifty percent complete.</w:t>
+        <w:t xml:space="preserve">Good morning. We are Rakhimzhanov Amangeldy and Nurkin Aidar. Our project is called Smart Traffic Lights That Learn. It is a systematic literature review of reinforcement learning for traffic signal control, and the subtitle says what we care about most: the road from simulation to real streets. In a systematic review we do not run our own experiments. Instead, we collect, filter and analyse published research using a strict and reproducible method. In the next ten minutes we will explain the problem, our research questions, how we search and screen the literature, the main idea of our review, what we have already built, and finally why we consider the project to be about fifty percent complete.</w:t>
       </w:r>
     </w:p>
     <w:bookmarkEnd w:id="20"/>
@@ -126,7 +67,7 @@
           <w:iCs/>
           <w:i/>
         </w:rPr>
-        <w:t xml:space="preserve">≈ 33 seconds (83 words)</w:t>
+        <w:t xml:space="preserve">≈ 1:00 min (149 words)</w:t>
       </w:r>
     </w:p>
     <w:p>
@@ -134,7 +75,7 @@
         <w:pStyle w:val="BodyText"/>
       </w:pPr>
       <w:r>
-        <w:t xml:space="preserve">Most traffic lights in our cities still run on fixed timers. The green phase lasts the same time at three in the morning and in rush hour. A learning traffic light is different: it watches real traffic through cameras and road sensors and adapts its timing. Research on this is booming, and many papers show shorter waiting times, but almost all of those results come from computer simulations. Real field tests are very rare. Understanding that gap is the core of our project.</w:t>
+        <w:t xml:space="preserve">Let us start with the problem. Most traffic lights in our cities still work on fixed timers. The green and red phases last the same time at three in the morning, when the road is empty, and at six in the evening, when it is jammed. Some lights react to a detector, but they still follow rules written by hand. A learning traffic light is different. It watches real traffic through cameras and road sensors and changes its timing on the fly, based on what it has learned works best. Research on this idea is booming, and hundreds of papers report shorter waiting times and shorter queues. But when we look closer, almost all of these results come from computer simulations. Peer-reviewed tests on real intersections are still very rare. Our review asks a simple question: why does this gap exist, and what would it take to close it?</w:t>
       </w:r>
     </w:p>
     <w:bookmarkEnd w:id="21"/>
@@ -156,7 +97,7 @@
           <w:iCs/>
           <w:i/>
         </w:rPr>
-        <w:t xml:space="preserve">≈ 28 seconds (71 words)</w:t>
+        <w:t xml:space="preserve">≈ 1:00 min (151 words)</w:t>
       </w:r>
     </w:p>
     <w:p>
@@ -164,7 +105,7 @@
         <w:pStyle w:val="BodyText"/>
       </w:pPr>
       <w:r>
-        <w:t xml:space="preserve">Why is this a smart system? Because it closes the full loop. It senses traffic with cameras and detectors, decides with an AI model, acts by switching the lights, and learns from a reward: the less people wait, the higher the reward. This is reinforcement learning, which learns by trial and error. That is also the catch: trial and error is cheap in a simulator but risky at a real intersection.</w:t>
+        <w:t xml:space="preserve">Why is this a smart system? Because a learning traffic light closes the full smart-system loop, shown here in four steps. First, it senses: cameras and road sensors measure how many cars are waiting. Second, it decides: a reinforcement learning agent, usually a neural network, chooses which direction gets the next green phase. Third, it acts: the signal switches on the road. Fourth, it learns: after each decision it receives a reward, which is higher when people wait less, and step by step it improves its policy. This is reinforcement learning, learning by trial and error instead of following a hand-made timing plan. And this is exactly where the difficulty comes from. Trial and error is cheap and safe inside a simulator, where a bad decision costs nothing. At a real intersection, a bad decision means real people stuck in traffic, and possibly safety risks. That explains much of the gap.</w:t>
       </w:r>
     </w:p>
     <w:bookmarkEnd w:id="22"/>
@@ -186,7 +127,7 @@
           <w:iCs/>
           <w:i/>
         </w:rPr>
-        <w:t xml:space="preserve">≈ 25 seconds (62 words)</w:t>
+        <w:t xml:space="preserve">≈ 0:58 min (145 words)</w:t>
       </w:r>
     </w:p>
     <w:p>
@@ -194,7 +135,7 @@
         <w:pStyle w:val="BodyText"/>
       </w:pPr>
       <w:r>
-        <w:t xml:space="preserve">Our proposal had four questions. We refined them into six that can actually be answered from published papers. Each one is linked to fields we will extract from every study. The two most important are RQ3, how realistically a method was tested, and RQ4, how much it really improves traffic. RQ5 and RQ6 turn the evidence into barriers and a research agenda.</w:t>
+        <w:t xml:space="preserve">Our project proposal asked four questions. During planning we refined them into six, because a good systematic review only asks questions that can be answered from published papers. The table shows each question and the information we will extract to answer it. RQ1 looks at the landscape: how fast the field is growing, in which venues and in which countries. RQ2 looks at the methods: which algorithms are used, and how the state, action and reward are designed. RQ3 asks how the methods are validated: only in simulators, or also on real roads. RQ4 asks how much they actually improve waiting time, queues and travel time compared with baselines such as fixed-time plans. RQ5 collects the barriers that stop deployment, together with the fixes researchers propose. And RQ6 turns everything into gaps and future research directions. RQ3 and RQ4 are the heart of our review.</w:t>
       </w:r>
     </w:p>
     <w:bookmarkEnd w:id="23"/>
@@ -216,7 +157,7 @@
           <w:iCs/>
           <w:i/>
         </w:rPr>
-        <w:t xml:space="preserve">≈ 30 seconds (75 words)</w:t>
+        <w:t xml:space="preserve">≈ 0:58 min (146 words)</w:t>
       </w:r>
     </w:p>
     <w:p>
@@ -224,7 +165,7 @@
         <w:pStyle w:val="BodyText"/>
       </w:pPr>
       <w:r>
-        <w:t xml:space="preserve">We follow PRISMA 2020, the standard for systematic reviews. First we fixed a protocol, so the rules cannot change after we see the results. Then we search three databases, and two reviewers screen every paper independently, first by title and abstract, then by full text. Each included study gets a quality score out of ten. Data goes into one codebook, and every number is traced to its page or table. Finally we synthesise the evidence.</w:t>
+        <w:t xml:space="preserve">To answer these questions we follow PRISMA 2020, the international reporting standard for systematic reviews. It has six stages. First, plan: our protocol fixes the questions, the inclusion and exclusion criteria and the analysis before we search, so we cannot change the rules after seeing the results. Second, search: we search Scopus, Web of Science and IEEE Xplore for papers from 2019 to 2026. Third, screen: the two of us screen every record independently, first by title and abstract, then by full text, and we measure our agreement with Cohen’s kappa. Every excluded paper gets one coded reason. Fourth, assess quality: each included study is scored on five criteria, zero to two points each, so ten points maximum. Fifth, extract: all data goes into one codebook, and every number is traced to its page or table. Sixth, synthesise the evidence and draw the PRISMA flow diagram.</w:t>
       </w:r>
     </w:p>
     <w:bookmarkEnd w:id="24"/>
@@ -246,7 +187,7 @@
           <w:iCs/>
           <w:i/>
         </w:rPr>
-        <w:t xml:space="preserve">≈ 29 seconds (72 words)</w:t>
+        <w:t xml:space="preserve">≈ 0:58 min (145 words)</w:t>
       </w:r>
     </w:p>
     <w:p>
@@ -254,7 +195,7 @@
         <w:pStyle w:val="BodyText"/>
       </w:pPr>
       <w:r>
-        <w:t xml:space="preserve">Our search combines two concepts with AND: reinforcement learning, with all its common names, and traffic signals. We wrote the exact search strings for Scopus, Web of Science and IEEE Xplore, for papers from 2019 to 2026, journal and conference papers in English. Before we lock the search, we pilot it: it must find most of 20 papers we already know are relevant. If it misses some, we add the missing terms.</w:t>
+        <w:t xml:space="preserve">Here is how the search works. We split the topic into two concepts and combine them with AND. Concept A is the method: reinforcement learning, together with its common names, such as Q-learning, deep Q-network, actor-critic, policy gradient and PPO. Concept B is the application: traffic signals, together with traffic lights, signalized intersections, signal timing and signal phases. A paper must match both concepts to be found. We wrote the exact search string separately for each database, because Scopus, Web of Science and IEEE Xplore use different syntax. We limit the search to 2019 to 2026, to journal and conference papers, and to English. Before we lock the search, we run a pilot. We prepared a list of 20 papers we already know are relevant. The pilot must find most of them. If it misses some, we add the missing terms and document the change.</w:t>
       </w:r>
     </w:p>
     <w:bookmarkEnd w:id="25"/>
@@ -276,7 +217,7 @@
           <w:iCs/>
           <w:i/>
         </w:rPr>
-        <w:t xml:space="preserve">≈ 31 seconds (77 words)</w:t>
+        <w:t xml:space="preserve">≈ 1:01 min (153 words)</w:t>
       </w:r>
     </w:p>
     <w:p>
@@ -284,7 +225,7 @@
         <w:pStyle w:val="BodyText"/>
       </w:pPr>
       <w:r>
-        <w:t xml:space="preserve">This is our main contribution. Earlier reviews ask which algorithm is best. We also ask how realistically each method was tested. We code every study on a six-level scale: from a purely synthetic simulation at level zero, through simulations with real traffic data and real hardware, up to a field test and a sustained deployment in a city. Then we can compare the reported improvements level by level and see whether the gains survive contact with reality.</w:t>
+        <w:t xml:space="preserve">This slide shows the main contribution of our review. Earlier reviews mostly ask which algorithm performs best. We also ask how realistically each method was tested. For this we defined a validation realism scale with six levels. Level zero is a purely synthetic simulation, an artificial grid with invented traffic. Level one uses a real road map but made-up traffic. Level two is a simulation driven by real traffic data. Level three puts real hardware, such as a real signal controller, in the loop, but the lights on the street are not controlled. Level four is a field test, where the agent actually switches the lights at a real intersection for a limited time. Level five is a sustained deployment in a city. Every study gets the highest level it reaches. Then we can compare the reported improvements level by level and see whether the gains shrink as the tests become more real.</w:t>
       </w:r>
     </w:p>
     <w:bookmarkEnd w:id="26"/>
@@ -306,7 +247,7 @@
           <w:iCs/>
           <w:i/>
         </w:rPr>
-        <w:t xml:space="preserve">≈ 26 seconds (66 words)</w:t>
+        <w:t xml:space="preserve">≈ 0:56 min (139 words)</w:t>
       </w:r>
     </w:p>
     <w:p>
@@ -314,7 +255,7 @@
         <w:pStyle w:val="BodyText"/>
       </w:pPr>
       <w:r>
-        <w:t xml:space="preserve">Before designing the search, we ran a scoping search. Four things stood out. Simulators like SUMO and CityFlow dominate. Papers that focus on deployment say almost no RL signals run on live streets. The last systematic review stops in 2020. And many papers reuse the same few city datasets, so we must avoid counting the same evidence twice. These are design inputs, not our final results.</w:t>
+        <w:t xml:space="preserve">Before designing the formal search, we ran a short scoping search to understand the field. These are design inputs, not results of our review, and they are not counted in the PRISMA numbers. Four observations stood out. First, simulators dominate: recent reviews name SUMO and CityFlow as the main test platforms. Second, field tests are rare: papers from 2021 and 2022 that focus on deployment report that RL signal controllers have almost never run on live streets. Third, the last systematic review on this topic, by Noaeen and colleagues, covered 160 papers but only up to March 2020, so recent years have not been systematically reviewed. Fourth, many papers reuse the same few city datasets, such as Jinan, Hangzhou and New York. So we must be careful not to count the same evidence twice, and our method handles that.</w:t>
       </w:r>
     </w:p>
     <w:bookmarkEnd w:id="27"/>
@@ -336,7 +277,7 @@
           <w:iCs/>
           <w:i/>
         </w:rPr>
-        <w:t xml:space="preserve">≈ 24 seconds (59 words)</w:t>
+        <w:t xml:space="preserve">≈ 0:54 min (135 words)</w:t>
       </w:r>
     </w:p>
     <w:p>
@@ -344,7 +285,7 @@
         <w:pStyle w:val="BodyText"/>
       </w:pPr>
       <w:r>
-        <w:t xml:space="preserve">Here is what exists today. Fifteen planning and method documents, combined into one 32-page dossier. Search strings for all three databases, ready to run. A codebook with 64 extraction fields. And a small software pipeline with ten commands that imports database exports, removes duplicates, manages screening, and draws the PRISMA diagram directly from our records. Its tests all pass.</w:t>
+        <w:t xml:space="preserve">So what have we actually produced so far? First, fifteen planning and method documents, covering all 27 steps of our review guideline, combined into one 32-page project dossier. Second, ready-to-run search strings for all three databases. Third, a codebook with 64 extraction fields, so that every study is described in exactly the same way. Fourth, a small software pipeline with ten commands. It imports the search results exported from the databases, removes duplicates, prepares the screening sheets for both reviewers, calculates our agreement, produces the quality and extraction sheets, and draws the PRISMA flow diagram. The key design rule is that every count and every statistic is computed from the records, never typed by hand. That makes our review reproducible and easy to audit. The pipeline has ten automated tests, and all of them pass.</w:t>
       </w:r>
     </w:p>
     <w:bookmarkEnd w:id="28"/>
@@ -366,7 +307,7 @@
           <w:iCs/>
           <w:i/>
         </w:rPr>
-        <w:t xml:space="preserve">≈ 44 seconds (109 words)</w:t>
+        <w:t xml:space="preserve">≈ 1:24 min (209 words)</w:t>
       </w:r>
     </w:p>
     <w:p>
@@ -374,10 +315,11 @@
         <w:pStyle w:val="BodyText"/>
       </w:pPr>
       <w:r>
-        <w:t xml:space="preserve">So how complete are we? We weighted the project by effort into six phases. Planning and the protocol are finished: 20 of 20 points. The search strategy is written for all three databases; only the pilot run and the formal lock are left, so 13 of 15. The tools for screening, quality scoring, extraction and synthesis are built and tested: 15 of 15. Synthesis has a draft taxonomy, worth 2 points. Searching, screening, extraction and writing have not started yet. That gives 50 out of 100. In other words, the design half of the review is complete, and the execution half starts now with the database searches. Thank you.</w:t>
+        <w:t xml:space="preserve">Finally, the question we were asked: how complete is the project, and why do we say fifty percent? We divided the whole project into six phases and gave each a weight based on the effort it needs, adding up to one hundred points. We only count work that is actually finished. Phase one, planning and the protocol, is complete: 20 out of 20. Phase two, the search strategy: the concepts, databases and search strings are done; only the pilot run and the formal lock are left, so 13 out of 15. Phase three, the review tools for screening, quality scoring, extraction and synthesis, is built and tested: 15 out of 15. Phase four, running the searches and screening, is next, so zero. Phase five, quality assessment and extraction, has not started: zero. Phase six, synthesis and writing, has a draft taxonomy, worth 2 out of 15. Together that is 50 out of 100. Put simply, the design half of the review is complete: we know exactly what to search, how to judge each paper and how to analyse the results. The execution half starts now, with the pilot search and the locked protocol as our next milestone. Thank you for your attention. We are happy to answer your questions.</w:t>
       </w:r>
     </w:p>
     <w:bookmarkEnd w:id="29"/>
+    <w:bookmarkEnd w:id="30"/>
     <w:sectPr/>
   </w:body>
 </w:document>

</xml_diff>

<commit_message>
Midterm deck: replace tools slide with early evidence from published studies
Co-Authored-By: Claude Opus 5.5 <noreply@anthropic.com>
Claude-Session: https://claude.ai/code/session_01Bwh39UnA2AtEyvQMyknFM2
</commit_message>
<xml_diff>
--- a/outputs/Speaker_Notes_Midterm.docx
+++ b/outputs/Speaker_Notes_Midterm.docx
@@ -2,7 +2,7 @@
 <file path=word/document.xml><?xml version="1.0" encoding="utf-8"?>
 <w:document xmlns:w="http://schemas.openxmlformats.org/wordprocessingml/2006/main" xmlns:m="http://schemas.openxmlformats.org/officeDocument/2006/math" xmlns:r="http://schemas.openxmlformats.org/officeDocument/2006/relationships" xmlns:o="urn:schemas-microsoft-com:office:office" xmlns:v="urn:schemas-microsoft-com:vml" xmlns:w10="urn:schemas-microsoft-com:office:word" xmlns:a="http://schemas.openxmlformats.org/drawingml/2006/main" xmlns:pic="http://schemas.openxmlformats.org/drawingml/2006/picture" xmlns:wp="http://schemas.openxmlformats.org/drawingml/2006/wordprocessingDrawing">
   <w:body>
-    <w:bookmarkStart w:id="30" w:name="X356062213ae04e9af47220a64bfdcc284a4a191"/>
+    <w:bookmarkStart w:id="31" w:name="X356062213ae04e9af47220a64bfdcc284a4a191"/>
     <w:p>
       <w:pPr>
         <w:pStyle w:val="Heading1"/>
@@ -16,7 +16,7 @@
         <w:pStyle w:val="FirstParagraph"/>
       </w:pPr>
       <w:r>
-        <w:t xml:space="preserve">Total: 1488 words ≈ 9.9 minutes at 150 words per minute (about one minute per slide).</w:t>
+        <w:t xml:space="preserve">Total: 1567 words ≈ 10.4 minutes at 150 words per minute (about one minute per slide).</w:t>
       </w:r>
     </w:p>
     <w:bookmarkStart w:id="20" w:name="slide-1-smart-traffic-lights-that-learn"/>
@@ -259,13 +259,13 @@
       </w:r>
     </w:p>
     <w:bookmarkEnd w:id="27"/>
-    <w:bookmarkStart w:id="28" w:name="slide-9-what-we-have-built-so-far"/>
+    <w:bookmarkStart w:id="28" w:name="X2f7464073ebcb8bc37a4e1ec19cef9f75c54655"/>
     <w:p>
       <w:pPr>
         <w:pStyle w:val="Heading2"/>
       </w:pPr>
       <w:r>
-        <w:t xml:space="preserve">Slide 9 — What we have built so far</w:t>
+        <w:t xml:space="preserve">Slide 9 — Early evidence: what published studies report</w:t>
       </w:r>
     </w:p>
     <w:p>
@@ -277,7 +277,7 @@
           <w:iCs/>
           <w:i/>
         </w:rPr>
-        <w:t xml:space="preserve">≈ 0:54 min (135 words)</w:t>
+        <w:t xml:space="preserve">≈ 1:12 min (180 words)</w:t>
       </w:r>
     </w:p>
     <w:p>
@@ -285,7 +285,7 @@
         <w:pStyle w:val="BodyText"/>
       </w:pPr>
       <w:r>
-        <w:t xml:space="preserve">So what have we actually produced so far? First, fifteen planning and method documents, covering all 27 steps of our review guideline, combined into one 32-page project dossier. Second, ready-to-run search strings for all three databases. Third, a codebook with 64 extraction fields, so that every study is described in exactly the same way. Fourth, a small software pipeline with ten commands. It imports the search results exported from the databases, removes duplicates, prepares the screening sheets for both reviewers, calculates our agreement, produces the quality and extraction sheets, and draws the PRISMA flow diagram. The key design rule is that every count and every statistic is computed from the records, never typed by hand. That makes our review reproducible and easy to audit. The pipeline has ten automated tests, and all of them pass.</w:t>
+        <w:t xml:space="preserve">Here is the first real evidence we collected from published papers during the scoping search. These numbers are reported by the authors themselves, in abstracts and benchmark tables. We have not yet checked them in the full texts, and they are not the results of our systematic review. Still, a pattern is visible. Against a fixed-time plan in simulation, a well-known method called CoLight cuts average travel time by about sixty percent, for example from 718 to 302 seconds on Hangzhou data. But when another paper re-runs the same method on the same data, it reports 348 seconds, fifteen percent worse, which shows a reproducibility problem. When the comparison is the real adaptive system already used at two Queensland intersections, the delay reduction falls to about a third, and that is still in simulation. Real adaptive signal pilots in Hangzhou and Nanchang, which are not RL, report around fifteen percent less delay on real streets. And we found no verified RL field test. So the tougher and more realistic the comparison, the smaller the gain. RQ4 will test this properly.</w:t>
       </w:r>
     </w:p>
     <w:bookmarkEnd w:id="28"/>
@@ -307,7 +307,7 @@
           <w:iCs/>
           <w:i/>
         </w:rPr>
-        <w:t xml:space="preserve">≈ 1:24 min (209 words)</w:t>
+        <w:t xml:space="preserve">≈ 1:37 min (243 words)</w:t>
       </w:r>
     </w:p>
     <w:p>
@@ -315,11 +315,101 @@
         <w:pStyle w:val="BodyText"/>
       </w:pPr>
       <w:r>
-        <w:t xml:space="preserve">Finally, the question we were asked: how complete is the project, and why do we say fifty percent? We divided the whole project into six phases and gave each a weight based on the effort it needs, adding up to one hundred points. We only count work that is actually finished. Phase one, planning and the protocol, is complete: 20 out of 20. Phase two, the search strategy: the concepts, databases and search strings are done; only the pilot run and the formal lock are left, so 13 out of 15. Phase three, the review tools for screening, quality scoring, extraction and synthesis, is built and tested: 15 out of 15. Phase four, running the searches and screening, is next, so zero. Phase five, quality assessment and extraction, has not started: zero. Phase six, synthesis and writing, has a draft taxonomy, worth 2 out of 15. Together that is 50 out of 100. Put simply, the design half of the review is complete: we know exactly what to search, how to judge each paper and how to analyse the results. The execution half starts now, with the pilot search and the locked protocol as our next milestone. Thank you for your attention. We are happy to answer your questions.</w:t>
+        <w:t xml:space="preserve">Finally, the question we were asked: how complete is the project, and why do we say fifty percent? We divided the whole project into six phases and gave each a weight based on the effort it needs, adding up to one hundred points. We only count work that is actually finished. Phase one, planning and the protocol, is complete: 20 out of 20. Phase two, the search strategy: the concepts, databases and search strings are done; only the pilot run and the formal lock are left, so 13 out of 15. Phase three, the review tools for screening, quality scoring, extraction and synthesis, is built and tested: 15 out of 15. Phase four, running the searches and screening, is next, so zero. Phase five, quality assessment and extraction, has not started: zero. Phase six, synthesis and writing, has a draft taxonomy and the first evidence sample you just saw, worth 2 out of 15. Behind this sit fifteen planning documents, search strings for three databases, a 64-field codebook and a tested toolkit that computes every PRISMA number from the records. Together that is 50 out of 100. Put simply, the design half of the review is complete: we know exactly what to search, how to judge each paper and how to analyse the results. The execution half starts now, with the pilot search and the locked protocol as our next milestone. Thank you for your attention. We are happy to answer your questions.</w:t>
       </w:r>
     </w:p>
     <w:bookmarkEnd w:id="29"/>
+    <w:bookmarkStart w:id="30" w:name="sources-for-slide-9-early-evidence"/>
+    <w:p>
+      <w:pPr>
+        <w:pStyle w:val="Heading2"/>
+      </w:pPr>
+      <w:r>
+        <w:t xml:space="preserve">Sources for slide 9 (early evidence)</w:t>
+      </w:r>
+    </w:p>
+    <w:p>
+      <w:pPr>
+        <w:pStyle w:val="FirstParagraph"/>
+      </w:pPr>
+      <w:r>
+        <w:t xml:space="preserve">Values as reported by the authors (abstracts or result tables), collected in the scoping search; to be verified in the full texts during the review.</w:t>
+      </w:r>
+    </w:p>
+    <w:p>
+      <w:pPr>
+        <w:numPr>
+          <w:ilvl w:val="0"/>
+          <w:numId w:val="1001"/>
+        </w:numPr>
+        <w:pStyle w:val="Compact"/>
+      </w:pPr>
+      <w:r>
+        <w:t xml:space="preserve">CoLight vs fixed-time on Hangzhou and Jinan (302.37 s vs 718.29 s; 309.93 s vs 814.11 s): benchmark table in DHLight, arXiv:2409.05037 (2024). Original CoLight: Wei et al., CIKM 2019, arXiv:1905.05717.</w:t>
+      </w:r>
+    </w:p>
+    <w:p>
+      <w:pPr>
+        <w:numPr>
+          <w:ilvl w:val="0"/>
+          <w:numId w:val="1001"/>
+        </w:numPr>
+        <w:pStyle w:val="Compact"/>
+      </w:pPr>
+      <w:r>
+        <w:t xml:space="preserve">CoLight re-run at 347.87 s on Hangzhou: arXiv:2404.11014 (2024), spatio-temporal hypergraph MARL paper.</w:t>
+      </w:r>
+    </w:p>
+    <w:p>
+      <w:pPr>
+        <w:numPr>
+          <w:ilvl w:val="0"/>
+          <w:numId w:val="1001"/>
+        </w:numPr>
+        <w:pStyle w:val="Compact"/>
+      </w:pPr>
+      <w:r>
+        <w:t xml:space="preserve">Pan (2023), Traffic Light Control with Reinforcement Learning, arXiv:2308.14295 (preprint): waiting time −57.1 % to −100 %, queue length −40.9 % to −100 %, total travel time −16.8 % to −68.0 % vs fixed signal plans; synthetic and real Hangzhou data.</w:t>
+      </w:r>
+    </w:p>
+    <w:p>
+      <w:pPr>
+        <w:numPr>
+          <w:ilvl w:val="0"/>
+          <w:numId w:val="1001"/>
+        </w:numPr>
+        <w:pStyle w:val="Compact"/>
+      </w:pPr>
+      <w:r>
+        <w:t xml:space="preserve">Tahir et al. (2026), Accident Analysis &amp; Prevention (PubMed 41812491): crash risk and delay −69.95 % and −33.14 % (Gold Coast Rd – Hope Island Rd), −87.75 % and −37.91 % (Granard Rd – Beaudesert Rd) vs the observed adaptive signal system; microsimulation.</w:t>
+      </w:r>
+    </w:p>
+    <w:p>
+      <w:pPr>
+        <w:numPr>
+          <w:ilvl w:val="0"/>
+          <w:numId w:val="1001"/>
+        </w:numPr>
+        <w:pStyle w:val="Compact"/>
+      </w:pPr>
+      <w:r>
+        <w:t xml:space="preserve">Big-data adaptive (non-RL) signal pilots in Hangzhou and Nanchang: over 15 % reduction in trip delay; Nature Communications (2025), https://www.nature.com/articles/s41467-025-56701-4.</w:t>
+      </w:r>
+    </w:p>
+    <w:p>
+      <w:pPr>
+        <w:numPr>
+          <w:ilvl w:val="0"/>
+          <w:numId w:val="1001"/>
+        </w:numPr>
+        <w:pStyle w:val="Compact"/>
+      </w:pPr>
+      <w:r>
+        <w:t xml:space="preserve">No RL field test found: targeted searches for field trials and real-world deployment returned only simulation studies; Chen, Fang &amp; Sadeh (2022, arXiv:2206.11996) and Müller &amp; Sabatelli (2022, arXiv:2206.10122) state that RL signal control has not yet been deployed in the field.</w:t>
+      </w:r>
+    </w:p>
     <w:bookmarkEnd w:id="30"/>
+    <w:bookmarkEnd w:id="31"/>
     <w:sectPr/>
   </w:body>
 </w:document>
@@ -426,8 +516,87 @@
       </w:pPr>
     </w:lvl>
   </w:abstractNum>
+  <w:abstractNum w:abstractNumId="991">
+    <w:nsid w:val="A991"/>
+    <w:multiLevelType w:val="multilevel"/>
+    <w:lvl w:ilvl="0">
+      <w:numFmt w:val="bullet"/>
+      <w:lvlText w:val="•"/>
+      <w:lvlJc w:val="left"/>
+      <w:pPr>
+        <w:ind w:left="720" w:hanging="480"/>
+      </w:pPr>
+    </w:lvl>
+    <w:lvl w:ilvl="1">
+      <w:numFmt w:val="bullet"/>
+      <w:lvlText w:val="–"/>
+      <w:lvlJc w:val="left"/>
+      <w:pPr>
+        <w:ind w:left="1440" w:hanging="480"/>
+      </w:pPr>
+    </w:lvl>
+    <w:lvl w:ilvl="2">
+      <w:numFmt w:val="bullet"/>
+      <w:lvlText w:val="•"/>
+      <w:lvlJc w:val="left"/>
+      <w:pPr>
+        <w:ind w:left="2160" w:hanging="480"/>
+      </w:pPr>
+    </w:lvl>
+    <w:lvl w:ilvl="3">
+      <w:numFmt w:val="bullet"/>
+      <w:lvlText w:val="–"/>
+      <w:lvlJc w:val="left"/>
+      <w:pPr>
+        <w:ind w:left="2880" w:hanging="480"/>
+      </w:pPr>
+    </w:lvl>
+    <w:lvl w:ilvl="4">
+      <w:numFmt w:val="bullet"/>
+      <w:lvlText w:val="•"/>
+      <w:lvlJc w:val="left"/>
+      <w:pPr>
+        <w:ind w:left="3600" w:hanging="480"/>
+      </w:pPr>
+    </w:lvl>
+    <w:lvl w:ilvl="5">
+      <w:numFmt w:val="bullet"/>
+      <w:lvlText w:val="–"/>
+      <w:lvlJc w:val="left"/>
+      <w:pPr>
+        <w:ind w:left="4320" w:hanging="480"/>
+      </w:pPr>
+    </w:lvl>
+    <w:lvl w:ilvl="6">
+      <w:numFmt w:val="bullet"/>
+      <w:lvlText w:val="•"/>
+      <w:lvlJc w:val="left"/>
+      <w:pPr>
+        <w:ind w:left="5040" w:hanging="480"/>
+      </w:pPr>
+    </w:lvl>
+    <w:lvl w:ilvl="7">
+      <w:numFmt w:val="bullet"/>
+      <w:lvlText w:val="–"/>
+      <w:lvlJc w:val="left"/>
+      <w:pPr>
+        <w:ind w:left="5760" w:hanging="480"/>
+      </w:pPr>
+    </w:lvl>
+    <w:lvl w:ilvl="8">
+      <w:numFmt w:val="bullet"/>
+      <w:lvlText w:val="•"/>
+      <w:lvlJc w:val="left"/>
+      <w:pPr>
+        <w:ind w:left="6480" w:hanging="480"/>
+      </w:pPr>
+    </w:lvl>
+  </w:abstractNum>
   <w:num w:numId="1000">
     <w:abstractNumId w:val="990"/>
+  </w:num>
+  <w:num w:numId="1001">
+    <w:abstractNumId w:val="991"/>
   </w:num>
 </w:numbering>
 </file>

</xml_diff>